<commit_message>
fixed the errors and changed the report
</commit_message>
<xml_diff>
--- a/отчет.docx
+++ b/отчет.docx
@@ -871,7 +871,6 @@
         <w:suppressAutoHyphens/>
         <w:rPr>
           <w:rFonts w:ascii="Times New Roman" w:hAnsi="Times New Roman" w:cs="Times New Roman"/>
-          <w:lang w:val="en-US"/>
         </w:rPr>
       </w:pPr>
       <w:r>
@@ -964,7 +963,6 @@
           <w:rFonts w:ascii="Times New Roman" w:hAnsi="Times New Roman" w:cs="Times New Roman"/>
         </w:rPr>
       </w:pPr>
-      <w:proofErr w:type="spellStart"/>
       <w:r>
         <w:rPr>
           <w:rFonts w:ascii="Times New Roman" w:hAnsi="Times New Roman" w:cs="Times New Roman"/>
@@ -972,15 +970,12 @@
         </w:rPr>
         <w:t>date</w:t>
       </w:r>
-      <w:proofErr w:type="spellEnd"/>
-      <w:r>
-        <w:rPr>
-          <w:rFonts w:ascii="Times New Roman" w:hAnsi="Times New Roman" w:cs="Times New Roman"/>
-          <w:lang w:val="en-US"/>
+      <w:r>
+        <w:rPr>
+          <w:rFonts w:ascii="Times New Roman" w:hAnsi="Times New Roman" w:cs="Times New Roman"/>
         </w:rPr>
         <w:t xml:space="preserve"> = </w:t>
       </w:r>
-      <w:proofErr w:type="spellStart"/>
       <w:proofErr w:type="gramStart"/>
       <w:r>
         <w:rPr>
@@ -989,11 +984,9 @@
         </w:rPr>
         <w:t>input</w:t>
       </w:r>
-      <w:proofErr w:type="spellEnd"/>
-      <w:r>
-        <w:rPr>
-          <w:rFonts w:ascii="Times New Roman" w:hAnsi="Times New Roman" w:cs="Times New Roman"/>
-          <w:lang w:val="en-US"/>
+      <w:r>
+        <w:rPr>
+          <w:rFonts w:ascii="Times New Roman" w:hAnsi="Times New Roman" w:cs="Times New Roman"/>
         </w:rPr>
         <w:t>(</w:t>
       </w:r>
@@ -1001,18 +994,15 @@
       <w:r>
         <w:rPr>
           <w:rFonts w:ascii="Times New Roman" w:hAnsi="Times New Roman" w:cs="Times New Roman"/>
-          <w:lang w:val="en-US"/>
         </w:rPr>
         <w:t>"Введите дату: ")</w:t>
       </w:r>
       <w:r>
         <w:rPr>
           <w:rFonts w:ascii="Times New Roman" w:hAnsi="Times New Roman" w:cs="Times New Roman"/>
-          <w:lang w:val="en-US"/>
         </w:rPr>
         <w:br/>
       </w:r>
-      <w:proofErr w:type="spellStart"/>
       <w:r>
         <w:rPr>
           <w:rFonts w:ascii="Times New Roman" w:hAnsi="Times New Roman" w:cs="Times New Roman"/>
@@ -1020,15 +1010,12 @@
         </w:rPr>
         <w:t>print</w:t>
       </w:r>
-      <w:proofErr w:type="spellEnd"/>
-      <w:r>
-        <w:rPr>
-          <w:rFonts w:ascii="Times New Roman" w:hAnsi="Times New Roman" w:cs="Times New Roman"/>
-          <w:lang w:val="en-US"/>
+      <w:r>
+        <w:rPr>
+          <w:rFonts w:ascii="Times New Roman" w:hAnsi="Times New Roman" w:cs="Times New Roman"/>
         </w:rPr>
         <w:t xml:space="preserve">("Вы ввели дату: ", </w:t>
       </w:r>
-      <w:proofErr w:type="spellStart"/>
       <w:r>
         <w:rPr>
           <w:rFonts w:ascii="Times New Roman" w:hAnsi="Times New Roman" w:cs="Times New Roman"/>
@@ -1036,11 +1023,9 @@
         </w:rPr>
         <w:t>date</w:t>
       </w:r>
-      <w:proofErr w:type="spellEnd"/>
-      <w:r>
-        <w:rPr>
-          <w:rFonts w:ascii="Times New Roman" w:hAnsi="Times New Roman" w:cs="Times New Roman"/>
-          <w:lang w:val="en-US"/>
+      <w:r>
+        <w:rPr>
+          <w:rFonts w:ascii="Times New Roman" w:hAnsi="Times New Roman" w:cs="Times New Roman"/>
         </w:rPr>
         <w:t>)</w:t>
       </w:r>
@@ -1057,6 +1042,7 @@
       <w:r>
         <w:rPr>
           <w:rFonts w:ascii="Times New Roman" w:hAnsi="Times New Roman" w:cs="Times New Roman"/>
+          <w:noProof/>
         </w:rPr>
         <w:drawing>
           <wp:inline distT="0" distB="0" distL="0" distR="0" wp14:anchorId="164EBB9B" wp14:editId="415D507F">
@@ -1278,6 +1264,7 @@
       <w:r>
         <w:rPr>
           <w:rFonts w:ascii="Times New Roman" w:hAnsi="Times New Roman" w:cs="Times New Roman"/>
+          <w:noProof/>
         </w:rPr>
         <w:drawing>
           <wp:inline distT="0" distB="0" distL="0" distR="0" wp14:anchorId="2F301631" wp14:editId="75513EB0">
@@ -1421,7 +1408,6 @@
           <w:rFonts w:ascii="Times New Roman" w:hAnsi="Times New Roman" w:cs="Times New Roman"/>
         </w:rPr>
       </w:pPr>
-      <w:proofErr w:type="spellStart"/>
       <w:r>
         <w:rPr>
           <w:rFonts w:ascii="Times New Roman" w:hAnsi="Times New Roman" w:cs="Times New Roman"/>
@@ -1430,15 +1416,12 @@
         <w:lastRenderedPageBreak/>
         <w:t>amount</w:t>
       </w:r>
-      <w:proofErr w:type="spellEnd"/>
-      <w:r>
-        <w:rPr>
-          <w:rFonts w:ascii="Times New Roman" w:hAnsi="Times New Roman" w:cs="Times New Roman"/>
-          <w:lang w:val="en-US"/>
+      <w:r>
+        <w:rPr>
+          <w:rFonts w:ascii="Times New Roman" w:hAnsi="Times New Roman" w:cs="Times New Roman"/>
         </w:rPr>
         <w:t xml:space="preserve"> = </w:t>
       </w:r>
-      <w:proofErr w:type="spellStart"/>
       <w:proofErr w:type="gramStart"/>
       <w:r>
         <w:rPr>
@@ -1447,15 +1430,12 @@
         </w:rPr>
         <w:t>float</w:t>
       </w:r>
-      <w:proofErr w:type="spellEnd"/>
-      <w:r>
-        <w:rPr>
-          <w:rFonts w:ascii="Times New Roman" w:hAnsi="Times New Roman" w:cs="Times New Roman"/>
-          <w:lang w:val="en-US"/>
+      <w:r>
+        <w:rPr>
+          <w:rFonts w:ascii="Times New Roman" w:hAnsi="Times New Roman" w:cs="Times New Roman"/>
         </w:rPr>
         <w:t>(</w:t>
       </w:r>
-      <w:proofErr w:type="spellStart"/>
       <w:proofErr w:type="gramEnd"/>
       <w:r>
         <w:rPr>
@@ -1464,22 +1444,18 @@
         </w:rPr>
         <w:t>input</w:t>
       </w:r>
-      <w:proofErr w:type="spellEnd"/>
-      <w:r>
-        <w:rPr>
-          <w:rFonts w:ascii="Times New Roman" w:hAnsi="Times New Roman" w:cs="Times New Roman"/>
-          <w:lang w:val="en-US"/>
+      <w:r>
+        <w:rPr>
+          <w:rFonts w:ascii="Times New Roman" w:hAnsi="Times New Roman" w:cs="Times New Roman"/>
         </w:rPr>
         <w:t>("Введите сумму, которую Вы положили в банк: "))</w:t>
       </w:r>
       <w:r>
         <w:rPr>
           <w:rFonts w:ascii="Times New Roman" w:hAnsi="Times New Roman" w:cs="Times New Roman"/>
-          <w:lang w:val="en-US"/>
         </w:rPr>
         <w:br/>
       </w:r>
-      <w:proofErr w:type="spellStart"/>
       <w:r>
         <w:rPr>
           <w:rFonts w:ascii="Times New Roman" w:hAnsi="Times New Roman" w:cs="Times New Roman"/>
@@ -1487,15 +1463,12 @@
         </w:rPr>
         <w:t>bet</w:t>
       </w:r>
-      <w:proofErr w:type="spellEnd"/>
-      <w:r>
-        <w:rPr>
-          <w:rFonts w:ascii="Times New Roman" w:hAnsi="Times New Roman" w:cs="Times New Roman"/>
-          <w:lang w:val="en-US"/>
+      <w:r>
+        <w:rPr>
+          <w:rFonts w:ascii="Times New Roman" w:hAnsi="Times New Roman" w:cs="Times New Roman"/>
         </w:rPr>
         <w:t xml:space="preserve"> = </w:t>
       </w:r>
-      <w:proofErr w:type="spellStart"/>
       <w:r>
         <w:rPr>
           <w:rFonts w:ascii="Times New Roman" w:hAnsi="Times New Roman" w:cs="Times New Roman"/>
@@ -1503,15 +1476,12 @@
         </w:rPr>
         <w:t>float</w:t>
       </w:r>
-      <w:proofErr w:type="spellEnd"/>
-      <w:r>
-        <w:rPr>
-          <w:rFonts w:ascii="Times New Roman" w:hAnsi="Times New Roman" w:cs="Times New Roman"/>
-          <w:lang w:val="en-US"/>
+      <w:r>
+        <w:rPr>
+          <w:rFonts w:ascii="Times New Roman" w:hAnsi="Times New Roman" w:cs="Times New Roman"/>
         </w:rPr>
         <w:t>(</w:t>
       </w:r>
-      <w:proofErr w:type="spellStart"/>
       <w:r>
         <w:rPr>
           <w:rFonts w:ascii="Times New Roman" w:hAnsi="Times New Roman" w:cs="Times New Roman"/>
@@ -1519,22 +1489,18 @@
         </w:rPr>
         <w:t>input</w:t>
       </w:r>
-      <w:proofErr w:type="spellEnd"/>
-      <w:r>
-        <w:rPr>
-          <w:rFonts w:ascii="Times New Roman" w:hAnsi="Times New Roman" w:cs="Times New Roman"/>
-          <w:lang w:val="en-US"/>
+      <w:r>
+        <w:rPr>
+          <w:rFonts w:ascii="Times New Roman" w:hAnsi="Times New Roman" w:cs="Times New Roman"/>
         </w:rPr>
         <w:t>("Введите процентную ставку (в виде десятичной дроби): "))</w:t>
       </w:r>
       <w:r>
         <w:rPr>
           <w:rFonts w:ascii="Times New Roman" w:hAnsi="Times New Roman" w:cs="Times New Roman"/>
-          <w:lang w:val="en-US"/>
         </w:rPr>
         <w:br/>
       </w:r>
-      <w:proofErr w:type="spellStart"/>
       <w:r>
         <w:rPr>
           <w:rFonts w:ascii="Times New Roman" w:hAnsi="Times New Roman" w:cs="Times New Roman"/>
@@ -1542,15 +1508,12 @@
         </w:rPr>
         <w:t>years</w:t>
       </w:r>
-      <w:proofErr w:type="spellEnd"/>
-      <w:r>
-        <w:rPr>
-          <w:rFonts w:ascii="Times New Roman" w:hAnsi="Times New Roman" w:cs="Times New Roman"/>
-          <w:lang w:val="en-US"/>
+      <w:r>
+        <w:rPr>
+          <w:rFonts w:ascii="Times New Roman" w:hAnsi="Times New Roman" w:cs="Times New Roman"/>
         </w:rPr>
         <w:t xml:space="preserve"> = </w:t>
       </w:r>
-      <w:proofErr w:type="spellStart"/>
       <w:r>
         <w:rPr>
           <w:rFonts w:ascii="Times New Roman" w:hAnsi="Times New Roman" w:cs="Times New Roman"/>
@@ -1558,15 +1521,12 @@
         </w:rPr>
         <w:t>float</w:t>
       </w:r>
-      <w:proofErr w:type="spellEnd"/>
-      <w:r>
-        <w:rPr>
-          <w:rFonts w:ascii="Times New Roman" w:hAnsi="Times New Roman" w:cs="Times New Roman"/>
-          <w:lang w:val="en-US"/>
+      <w:r>
+        <w:rPr>
+          <w:rFonts w:ascii="Times New Roman" w:hAnsi="Times New Roman" w:cs="Times New Roman"/>
         </w:rPr>
         <w:t>(</w:t>
       </w:r>
-      <w:proofErr w:type="spellStart"/>
       <w:r>
         <w:rPr>
           <w:rFonts w:ascii="Times New Roman" w:hAnsi="Times New Roman" w:cs="Times New Roman"/>
@@ -1574,22 +1534,18 @@
         </w:rPr>
         <w:t>input</w:t>
       </w:r>
-      <w:proofErr w:type="spellEnd"/>
-      <w:r>
-        <w:rPr>
-          <w:rFonts w:ascii="Times New Roman" w:hAnsi="Times New Roman" w:cs="Times New Roman"/>
-          <w:lang w:val="en-US"/>
+      <w:r>
+        <w:rPr>
+          <w:rFonts w:ascii="Times New Roman" w:hAnsi="Times New Roman" w:cs="Times New Roman"/>
         </w:rPr>
         <w:t>("Введите период (в годах): "))</w:t>
       </w:r>
       <w:r>
         <w:rPr>
           <w:rFonts w:ascii="Times New Roman" w:hAnsi="Times New Roman" w:cs="Times New Roman"/>
-          <w:lang w:val="en-US"/>
         </w:rPr>
         <w:br/>
       </w:r>
-      <w:proofErr w:type="spellStart"/>
       <w:r>
         <w:rPr>
           <w:rFonts w:ascii="Times New Roman" w:hAnsi="Times New Roman" w:cs="Times New Roman"/>
@@ -1597,15 +1553,12 @@
         </w:rPr>
         <w:t>result</w:t>
       </w:r>
-      <w:proofErr w:type="spellEnd"/>
-      <w:r>
-        <w:rPr>
-          <w:rFonts w:ascii="Times New Roman" w:hAnsi="Times New Roman" w:cs="Times New Roman"/>
-          <w:lang w:val="en-US"/>
+      <w:r>
+        <w:rPr>
+          <w:rFonts w:ascii="Times New Roman" w:hAnsi="Times New Roman" w:cs="Times New Roman"/>
         </w:rPr>
         <w:t xml:space="preserve"> = </w:t>
       </w:r>
-      <w:proofErr w:type="spellStart"/>
       <w:r>
         <w:rPr>
           <w:rFonts w:ascii="Times New Roman" w:hAnsi="Times New Roman" w:cs="Times New Roman"/>
@@ -1613,15 +1566,12 @@
         </w:rPr>
         <w:t>amount</w:t>
       </w:r>
-      <w:proofErr w:type="spellEnd"/>
-      <w:r>
-        <w:rPr>
-          <w:rFonts w:ascii="Times New Roman" w:hAnsi="Times New Roman" w:cs="Times New Roman"/>
-          <w:lang w:val="en-US"/>
+      <w:r>
+        <w:rPr>
+          <w:rFonts w:ascii="Times New Roman" w:hAnsi="Times New Roman" w:cs="Times New Roman"/>
         </w:rPr>
         <w:t xml:space="preserve"> * (1 + </w:t>
       </w:r>
-      <w:proofErr w:type="spellStart"/>
       <w:r>
         <w:rPr>
           <w:rFonts w:ascii="Times New Roman" w:hAnsi="Times New Roman" w:cs="Times New Roman"/>
@@ -1629,15 +1579,12 @@
         </w:rPr>
         <w:t>bet</w:t>
       </w:r>
-      <w:proofErr w:type="spellEnd"/>
-      <w:r>
-        <w:rPr>
-          <w:rFonts w:ascii="Times New Roman" w:hAnsi="Times New Roman" w:cs="Times New Roman"/>
-          <w:lang w:val="en-US"/>
+      <w:r>
+        <w:rPr>
+          <w:rFonts w:ascii="Times New Roman" w:hAnsi="Times New Roman" w:cs="Times New Roman"/>
         </w:rPr>
         <w:t xml:space="preserve">) ** </w:t>
       </w:r>
-      <w:proofErr w:type="spellStart"/>
       <w:r>
         <w:rPr>
           <w:rFonts w:ascii="Times New Roman" w:hAnsi="Times New Roman" w:cs="Times New Roman"/>
@@ -1645,15 +1592,12 @@
         </w:rPr>
         <w:t>years</w:t>
       </w:r>
-      <w:proofErr w:type="spellEnd"/>
-      <w:r>
-        <w:rPr>
-          <w:rFonts w:ascii="Times New Roman" w:hAnsi="Times New Roman" w:cs="Times New Roman"/>
-          <w:lang w:val="en-US"/>
+      <w:r>
+        <w:rPr>
+          <w:rFonts w:ascii="Times New Roman" w:hAnsi="Times New Roman" w:cs="Times New Roman"/>
         </w:rPr>
         <w:br/>
       </w:r>
-      <w:proofErr w:type="spellStart"/>
       <w:r>
         <w:rPr>
           <w:rFonts w:ascii="Times New Roman" w:hAnsi="Times New Roman" w:cs="Times New Roman"/>
@@ -1661,29 +1605,50 @@
         </w:rPr>
         <w:t>print</w:t>
       </w:r>
-      <w:proofErr w:type="spellEnd"/>
-      <w:r>
-        <w:rPr>
-          <w:rFonts w:ascii="Times New Roman" w:hAnsi="Times New Roman" w:cs="Times New Roman"/>
-          <w:lang w:val="en-US"/>
+      <w:r>
+        <w:rPr>
+          <w:rFonts w:ascii="Times New Roman" w:hAnsi="Times New Roman" w:cs="Times New Roman"/>
         </w:rPr>
         <w:t>(</w:t>
       </w:r>
-      <w:proofErr w:type="spellStart"/>
-      <w:r>
-        <w:rPr>
-          <w:rFonts w:ascii="Times New Roman" w:hAnsi="Times New Roman" w:cs="Times New Roman"/>
-          <w:lang w:val="en-US"/>
-        </w:rPr>
-        <w:t>f"Итоговая</w:t>
-      </w:r>
-      <w:proofErr w:type="spellEnd"/>
-      <w:r>
-        <w:rPr>
-          <w:rFonts w:ascii="Times New Roman" w:hAnsi="Times New Roman" w:cs="Times New Roman"/>
-          <w:lang w:val="en-US"/>
-        </w:rPr>
-        <w:t xml:space="preserve"> сумма: {result:.2f} рублей")</w:t>
+      <w:r>
+        <w:rPr>
+          <w:rFonts w:ascii="Times New Roman" w:hAnsi="Times New Roman" w:cs="Times New Roman"/>
+          <w:lang w:val="en-US"/>
+        </w:rPr>
+        <w:t>f</w:t>
+      </w:r>
+      <w:r>
+        <w:rPr>
+          <w:rFonts w:ascii="Times New Roman" w:hAnsi="Times New Roman" w:cs="Times New Roman"/>
+        </w:rPr>
+        <w:t>"Итоговая сумма: {</w:t>
+      </w:r>
+      <w:r>
+        <w:rPr>
+          <w:rFonts w:ascii="Times New Roman" w:hAnsi="Times New Roman" w:cs="Times New Roman"/>
+          <w:lang w:val="en-US"/>
+        </w:rPr>
+        <w:t>result</w:t>
+      </w:r>
+      <w:r>
+        <w:rPr>
+          <w:rFonts w:ascii="Times New Roman" w:hAnsi="Times New Roman" w:cs="Times New Roman"/>
+        </w:rPr>
+        <w:t>:.2</w:t>
+      </w:r>
+      <w:r>
+        <w:rPr>
+          <w:rFonts w:ascii="Times New Roman" w:hAnsi="Times New Roman" w:cs="Times New Roman"/>
+          <w:lang w:val="en-US"/>
+        </w:rPr>
+        <w:t>f</w:t>
+      </w:r>
+      <w:r>
+        <w:rPr>
+          <w:rFonts w:ascii="Times New Roman" w:hAnsi="Times New Roman" w:cs="Times New Roman"/>
+        </w:rPr>
+        <w:t>} рублей")</w:t>
       </w:r>
     </w:p>
     <w:p>
@@ -1698,6 +1663,7 @@
       <w:r>
         <w:rPr>
           <w:rFonts w:ascii="Times New Roman" w:hAnsi="Times New Roman" w:cs="Times New Roman"/>
+          <w:noProof/>
         </w:rPr>
         <w:drawing>
           <wp:inline distT="0" distB="0" distL="0" distR="0" wp14:anchorId="6E66A850" wp14:editId="7B2B1F6B">
@@ -2006,6 +1972,7 @@
       <w:r>
         <w:rPr>
           <w:rFonts w:ascii="Times New Roman" w:hAnsi="Times New Roman" w:cs="Times New Roman"/>
+          <w:noProof/>
         </w:rPr>
         <w:drawing>
           <wp:inline distT="0" distB="0" distL="0" distR="0" wp14:anchorId="0AF7DD1E" wp14:editId="68C7D514">
@@ -2145,9 +2112,14 @@
           <w:lang w:val="en-US"/>
         </w:rPr>
         <w:lastRenderedPageBreak/>
-        <w:t xml:space="preserve">a = </w:t>
-      </w:r>
-      <w:proofErr w:type="spellStart"/>
+        <w:t>a</w:t>
+      </w:r>
+      <w:r>
+        <w:rPr>
+          <w:rFonts w:ascii="Times New Roman" w:hAnsi="Times New Roman" w:cs="Times New Roman"/>
+        </w:rPr>
+        <w:t xml:space="preserve"> = </w:t>
+      </w:r>
       <w:r>
         <w:rPr>
           <w:rFonts w:ascii="Times New Roman" w:hAnsi="Times New Roman" w:cs="Times New Roman"/>
@@ -2155,15 +2127,12 @@
         </w:rPr>
         <w:t>float</w:t>
       </w:r>
-      <w:proofErr w:type="spellEnd"/>
-      <w:r>
-        <w:rPr>
-          <w:rFonts w:ascii="Times New Roman" w:hAnsi="Times New Roman" w:cs="Times New Roman"/>
-          <w:lang w:val="en-US"/>
+      <w:r>
+        <w:rPr>
+          <w:rFonts w:ascii="Times New Roman" w:hAnsi="Times New Roman" w:cs="Times New Roman"/>
         </w:rPr>
         <w:t>(</w:t>
       </w:r>
-      <w:proofErr w:type="spellStart"/>
       <w:r>
         <w:rPr>
           <w:rFonts w:ascii="Times New Roman" w:hAnsi="Times New Roman" w:cs="Times New Roman"/>
@@ -2171,23 +2140,44 @@
         </w:rPr>
         <w:t>input</w:t>
       </w:r>
-      <w:proofErr w:type="spellEnd"/>
-      <w:r>
-        <w:rPr>
-          <w:rFonts w:ascii="Times New Roman" w:hAnsi="Times New Roman" w:cs="Times New Roman"/>
-          <w:lang w:val="en-US"/>
-        </w:rPr>
-        <w:t>("Введите a: "))</w:t>
-      </w:r>
-      <w:r>
-        <w:rPr>
-          <w:rFonts w:ascii="Times New Roman" w:hAnsi="Times New Roman" w:cs="Times New Roman"/>
-          <w:lang w:val="en-US"/>
+      <w:r>
+        <w:rPr>
+          <w:rFonts w:ascii="Times New Roman" w:hAnsi="Times New Roman" w:cs="Times New Roman"/>
+        </w:rPr>
+        <w:t xml:space="preserve">("Введите </w:t>
+      </w:r>
+      <w:r>
+        <w:rPr>
+          <w:rFonts w:ascii="Times New Roman" w:hAnsi="Times New Roman" w:cs="Times New Roman"/>
+          <w:lang w:val="en-US"/>
+        </w:rPr>
+        <w:t>a</w:t>
+      </w:r>
+      <w:r>
+        <w:rPr>
+          <w:rFonts w:ascii="Times New Roman" w:hAnsi="Times New Roman" w:cs="Times New Roman"/>
+        </w:rPr>
+        <w:t>: "))</w:t>
+      </w:r>
+      <w:r>
+        <w:rPr>
+          <w:rFonts w:ascii="Times New Roman" w:hAnsi="Times New Roman" w:cs="Times New Roman"/>
         </w:rPr>
         <w:br/>
-        <w:t xml:space="preserve">b = </w:t>
-      </w:r>
-      <w:proofErr w:type="spellStart"/>
+      </w:r>
+      <w:r>
+        <w:rPr>
+          <w:rFonts w:ascii="Times New Roman" w:hAnsi="Times New Roman" w:cs="Times New Roman"/>
+          <w:lang w:val="en-US"/>
+        </w:rPr>
+        <w:t>b</w:t>
+      </w:r>
+      <w:r>
+        <w:rPr>
+          <w:rFonts w:ascii="Times New Roman" w:hAnsi="Times New Roman" w:cs="Times New Roman"/>
+        </w:rPr>
+        <w:t xml:space="preserve"> = </w:t>
+      </w:r>
       <w:r>
         <w:rPr>
           <w:rFonts w:ascii="Times New Roman" w:hAnsi="Times New Roman" w:cs="Times New Roman"/>
@@ -2195,15 +2185,12 @@
         </w:rPr>
         <w:t>float</w:t>
       </w:r>
-      <w:proofErr w:type="spellEnd"/>
-      <w:r>
-        <w:rPr>
-          <w:rFonts w:ascii="Times New Roman" w:hAnsi="Times New Roman" w:cs="Times New Roman"/>
-          <w:lang w:val="en-US"/>
+      <w:r>
+        <w:rPr>
+          <w:rFonts w:ascii="Times New Roman" w:hAnsi="Times New Roman" w:cs="Times New Roman"/>
         </w:rPr>
         <w:t>(</w:t>
       </w:r>
-      <w:proofErr w:type="spellStart"/>
       <w:r>
         <w:rPr>
           <w:rFonts w:ascii="Times New Roman" w:hAnsi="Times New Roman" w:cs="Times New Roman"/>
@@ -2211,23 +2198,44 @@
         </w:rPr>
         <w:t>input</w:t>
       </w:r>
-      <w:proofErr w:type="spellEnd"/>
-      <w:r>
-        <w:rPr>
-          <w:rFonts w:ascii="Times New Roman" w:hAnsi="Times New Roman" w:cs="Times New Roman"/>
-          <w:lang w:val="en-US"/>
-        </w:rPr>
-        <w:t>("Введите b: "))</w:t>
-      </w:r>
-      <w:r>
-        <w:rPr>
-          <w:rFonts w:ascii="Times New Roman" w:hAnsi="Times New Roman" w:cs="Times New Roman"/>
-          <w:lang w:val="en-US"/>
+      <w:r>
+        <w:rPr>
+          <w:rFonts w:ascii="Times New Roman" w:hAnsi="Times New Roman" w:cs="Times New Roman"/>
+        </w:rPr>
+        <w:t xml:space="preserve">("Введите </w:t>
+      </w:r>
+      <w:r>
+        <w:rPr>
+          <w:rFonts w:ascii="Times New Roman" w:hAnsi="Times New Roman" w:cs="Times New Roman"/>
+          <w:lang w:val="en-US"/>
+        </w:rPr>
+        <w:t>b</w:t>
+      </w:r>
+      <w:r>
+        <w:rPr>
+          <w:rFonts w:ascii="Times New Roman" w:hAnsi="Times New Roman" w:cs="Times New Roman"/>
+        </w:rPr>
+        <w:t>: "))</w:t>
+      </w:r>
+      <w:r>
+        <w:rPr>
+          <w:rFonts w:ascii="Times New Roman" w:hAnsi="Times New Roman" w:cs="Times New Roman"/>
         </w:rPr>
         <w:br/>
-        <w:t xml:space="preserve">c = </w:t>
-      </w:r>
-      <w:proofErr w:type="spellStart"/>
+      </w:r>
+      <w:r>
+        <w:rPr>
+          <w:rFonts w:ascii="Times New Roman" w:hAnsi="Times New Roman" w:cs="Times New Roman"/>
+          <w:lang w:val="en-US"/>
+        </w:rPr>
+        <w:t>c</w:t>
+      </w:r>
+      <w:r>
+        <w:rPr>
+          <w:rFonts w:ascii="Times New Roman" w:hAnsi="Times New Roman" w:cs="Times New Roman"/>
+        </w:rPr>
+        <w:t xml:space="preserve"> = </w:t>
+      </w:r>
       <w:r>
         <w:rPr>
           <w:rFonts w:ascii="Times New Roman" w:hAnsi="Times New Roman" w:cs="Times New Roman"/>
@@ -2235,15 +2243,12 @@
         </w:rPr>
         <w:t>float</w:t>
       </w:r>
-      <w:proofErr w:type="spellEnd"/>
-      <w:r>
-        <w:rPr>
-          <w:rFonts w:ascii="Times New Roman" w:hAnsi="Times New Roman" w:cs="Times New Roman"/>
-          <w:lang w:val="en-US"/>
+      <w:r>
+        <w:rPr>
+          <w:rFonts w:ascii="Times New Roman" w:hAnsi="Times New Roman" w:cs="Times New Roman"/>
         </w:rPr>
         <w:t>(</w:t>
       </w:r>
-      <w:proofErr w:type="spellStart"/>
       <w:r>
         <w:rPr>
           <w:rFonts w:ascii="Times New Roman" w:hAnsi="Times New Roman" w:cs="Times New Roman"/>
@@ -2251,30 +2256,83 @@
         </w:rPr>
         <w:t>input</w:t>
       </w:r>
-      <w:proofErr w:type="spellEnd"/>
-      <w:r>
-        <w:rPr>
-          <w:rFonts w:ascii="Times New Roman" w:hAnsi="Times New Roman" w:cs="Times New Roman"/>
-          <w:lang w:val="en-US"/>
-        </w:rPr>
-        <w:t>("Введите c: "))</w:t>
-      </w:r>
-      <w:r>
-        <w:rPr>
-          <w:rFonts w:ascii="Times New Roman" w:hAnsi="Times New Roman" w:cs="Times New Roman"/>
-          <w:lang w:val="en-US"/>
+      <w:r>
+        <w:rPr>
+          <w:rFonts w:ascii="Times New Roman" w:hAnsi="Times New Roman" w:cs="Times New Roman"/>
+        </w:rPr>
+        <w:t xml:space="preserve">("Введите </w:t>
+      </w:r>
+      <w:r>
+        <w:rPr>
+          <w:rFonts w:ascii="Times New Roman" w:hAnsi="Times New Roman" w:cs="Times New Roman"/>
+          <w:lang w:val="en-US"/>
+        </w:rPr>
+        <w:t>c</w:t>
+      </w:r>
+      <w:r>
+        <w:rPr>
+          <w:rFonts w:ascii="Times New Roman" w:hAnsi="Times New Roman" w:cs="Times New Roman"/>
+        </w:rPr>
+        <w:t>: "))</w:t>
+      </w:r>
+      <w:r>
+        <w:rPr>
+          <w:rFonts w:ascii="Times New Roman" w:hAnsi="Times New Roman" w:cs="Times New Roman"/>
         </w:rPr>
         <w:br/>
-        <w:t>D = b**2 - 4*a*c</w:t>
-      </w:r>
-      <w:r>
-        <w:rPr>
-          <w:rFonts w:ascii="Times New Roman" w:hAnsi="Times New Roman" w:cs="Times New Roman"/>
-          <w:lang w:val="en-US"/>
+      </w:r>
+      <w:r>
+        <w:rPr>
+          <w:rFonts w:ascii="Times New Roman" w:hAnsi="Times New Roman" w:cs="Times New Roman"/>
+          <w:lang w:val="en-US"/>
+        </w:rPr>
+        <w:t>D</w:t>
+      </w:r>
+      <w:r>
+        <w:rPr>
+          <w:rFonts w:ascii="Times New Roman" w:hAnsi="Times New Roman" w:cs="Times New Roman"/>
+        </w:rPr>
+        <w:t xml:space="preserve"> = </w:t>
+      </w:r>
+      <w:r>
+        <w:rPr>
+          <w:rFonts w:ascii="Times New Roman" w:hAnsi="Times New Roman" w:cs="Times New Roman"/>
+          <w:lang w:val="en-US"/>
+        </w:rPr>
+        <w:t>b</w:t>
+      </w:r>
+      <w:r>
+        <w:rPr>
+          <w:rFonts w:ascii="Times New Roman" w:hAnsi="Times New Roman" w:cs="Times New Roman"/>
+        </w:rPr>
+        <w:t>**2 - 4*</w:t>
+      </w:r>
+      <w:r>
+        <w:rPr>
+          <w:rFonts w:ascii="Times New Roman" w:hAnsi="Times New Roman" w:cs="Times New Roman"/>
+          <w:lang w:val="en-US"/>
+        </w:rPr>
+        <w:t>a</w:t>
+      </w:r>
+      <w:r>
+        <w:rPr>
+          <w:rFonts w:ascii="Times New Roman" w:hAnsi="Times New Roman" w:cs="Times New Roman"/>
+        </w:rPr>
+        <w:t>*</w:t>
+      </w:r>
+      <w:r>
+        <w:rPr>
+          <w:rFonts w:ascii="Times New Roman" w:hAnsi="Times New Roman" w:cs="Times New Roman"/>
+          <w:lang w:val="en-US"/>
+        </w:rPr>
+        <w:t>c</w:t>
+      </w:r>
+      <w:r>
+        <w:rPr>
+          <w:rFonts w:ascii="Times New Roman" w:hAnsi="Times New Roman" w:cs="Times New Roman"/>
         </w:rPr>
         <w:br/>
       </w:r>
-      <w:proofErr w:type="spellStart"/>
       <w:r>
         <w:rPr>
           <w:rFonts w:ascii="Times New Roman" w:hAnsi="Times New Roman" w:cs="Times New Roman"/>
@@ -2282,185 +2340,364 @@
         </w:rPr>
         <w:t>if</w:t>
       </w:r>
-      <w:proofErr w:type="spellEnd"/>
-      <w:r>
-        <w:rPr>
-          <w:rFonts w:ascii="Times New Roman" w:hAnsi="Times New Roman" w:cs="Times New Roman"/>
-          <w:lang w:val="en-US"/>
-        </w:rPr>
-        <w:t xml:space="preserve"> D &gt; 0:</w:t>
-      </w:r>
-      <w:r>
-        <w:rPr>
-          <w:rFonts w:ascii="Times New Roman" w:hAnsi="Times New Roman" w:cs="Times New Roman"/>
-          <w:lang w:val="en-US"/>
-        </w:rPr>
-        <w:br/>
-        <w:t xml:space="preserve">    x1 = (-b + D**0.5) / (2*a)</w:t>
-      </w:r>
-      <w:r>
-        <w:rPr>
-          <w:rFonts w:ascii="Times New Roman" w:hAnsi="Times New Roman" w:cs="Times New Roman"/>
-          <w:lang w:val="en-US"/>
-        </w:rPr>
-        <w:br/>
-        <w:t xml:space="preserve">    x2 = (-b - D**0.5) / (2*a)</w:t>
-      </w:r>
-      <w:r>
-        <w:rPr>
-          <w:rFonts w:ascii="Times New Roman" w:hAnsi="Times New Roman" w:cs="Times New Roman"/>
-          <w:lang w:val="en-US"/>
+      <w:r>
+        <w:rPr>
+          <w:rFonts w:ascii="Times New Roman" w:hAnsi="Times New Roman" w:cs="Times New Roman"/>
+        </w:rPr>
+        <w:t xml:space="preserve"> </w:t>
+      </w:r>
+      <w:r>
+        <w:rPr>
+          <w:rFonts w:ascii="Times New Roman" w:hAnsi="Times New Roman" w:cs="Times New Roman"/>
+          <w:lang w:val="en-US"/>
+        </w:rPr>
+        <w:t>D</w:t>
+      </w:r>
+      <w:r>
+        <w:rPr>
+          <w:rFonts w:ascii="Times New Roman" w:hAnsi="Times New Roman" w:cs="Times New Roman"/>
+        </w:rPr>
+        <w:t xml:space="preserve"> &gt; 0:</w:t>
+      </w:r>
+      <w:r>
+        <w:rPr>
+          <w:rFonts w:ascii="Times New Roman" w:hAnsi="Times New Roman" w:cs="Times New Roman"/>
         </w:rPr>
         <w:br/>
         <w:t xml:space="preserve">    </w:t>
       </w:r>
-      <w:proofErr w:type="spellStart"/>
-      <w:r>
-        <w:rPr>
-          <w:rFonts w:ascii="Times New Roman" w:hAnsi="Times New Roman" w:cs="Times New Roman"/>
-          <w:lang w:val="en-US"/>
-        </w:rPr>
-        <w:t>print</w:t>
-      </w:r>
-      <w:proofErr w:type="spellEnd"/>
-      <w:r>
-        <w:rPr>
-          <w:rFonts w:ascii="Times New Roman" w:hAnsi="Times New Roman" w:cs="Times New Roman"/>
-          <w:lang w:val="en-US"/>
-        </w:rPr>
-        <w:t>(</w:t>
-      </w:r>
-      <w:proofErr w:type="spellStart"/>
-      <w:r>
-        <w:rPr>
-          <w:rFonts w:ascii="Times New Roman" w:hAnsi="Times New Roman" w:cs="Times New Roman"/>
-          <w:lang w:val="en-US"/>
-        </w:rPr>
-        <w:t>f"Корни</w:t>
-      </w:r>
-      <w:proofErr w:type="spellEnd"/>
-      <w:r>
-        <w:rPr>
-          <w:rFonts w:ascii="Times New Roman" w:hAnsi="Times New Roman" w:cs="Times New Roman"/>
-          <w:lang w:val="en-US"/>
-        </w:rPr>
-        <w:t xml:space="preserve"> уравнения: {x1}, {x2}")</w:t>
-      </w:r>
-      <w:r>
-        <w:rPr>
-          <w:rFonts w:ascii="Times New Roman" w:hAnsi="Times New Roman" w:cs="Times New Roman"/>
-          <w:lang w:val="en-US"/>
-        </w:rPr>
-        <w:br/>
-      </w:r>
-      <w:proofErr w:type="spellStart"/>
-      <w:r>
-        <w:rPr>
-          <w:rFonts w:ascii="Times New Roman" w:hAnsi="Times New Roman" w:cs="Times New Roman"/>
-          <w:lang w:val="en-US"/>
-        </w:rPr>
-        <w:t>elif</w:t>
-      </w:r>
-      <w:proofErr w:type="spellEnd"/>
-      <w:r>
-        <w:rPr>
-          <w:rFonts w:ascii="Times New Roman" w:hAnsi="Times New Roman" w:cs="Times New Roman"/>
-          <w:lang w:val="en-US"/>
-        </w:rPr>
-        <w:t xml:space="preserve"> D == 0:</w:t>
-      </w:r>
-      <w:r>
-        <w:rPr>
-          <w:rFonts w:ascii="Times New Roman" w:hAnsi="Times New Roman" w:cs="Times New Roman"/>
-          <w:lang w:val="en-US"/>
-        </w:rPr>
-        <w:br/>
-        <w:t xml:space="preserve">    x = -b / (2*a)</w:t>
-      </w:r>
-      <w:r>
-        <w:rPr>
-          <w:rFonts w:ascii="Times New Roman" w:hAnsi="Times New Roman" w:cs="Times New Roman"/>
-          <w:lang w:val="en-US"/>
+      <w:r>
+        <w:rPr>
+          <w:rFonts w:ascii="Times New Roman" w:hAnsi="Times New Roman" w:cs="Times New Roman"/>
+          <w:lang w:val="en-US"/>
+        </w:rPr>
+        <w:t>x</w:t>
+      </w:r>
+      <w:r>
+        <w:rPr>
+          <w:rFonts w:ascii="Times New Roman" w:hAnsi="Times New Roman" w:cs="Times New Roman"/>
+        </w:rPr>
+        <w:t>1 = (-</w:t>
+      </w:r>
+      <w:r>
+        <w:rPr>
+          <w:rFonts w:ascii="Times New Roman" w:hAnsi="Times New Roman" w:cs="Times New Roman"/>
+          <w:lang w:val="en-US"/>
+        </w:rPr>
+        <w:t>b</w:t>
+      </w:r>
+      <w:r>
+        <w:rPr>
+          <w:rFonts w:ascii="Times New Roman" w:hAnsi="Times New Roman" w:cs="Times New Roman"/>
+        </w:rPr>
+        <w:t xml:space="preserve"> + </w:t>
+      </w:r>
+      <w:r>
+        <w:rPr>
+          <w:rFonts w:ascii="Times New Roman" w:hAnsi="Times New Roman" w:cs="Times New Roman"/>
+          <w:lang w:val="en-US"/>
+        </w:rPr>
+        <w:t>D</w:t>
+      </w:r>
+      <w:r>
+        <w:rPr>
+          <w:rFonts w:ascii="Times New Roman" w:hAnsi="Times New Roman" w:cs="Times New Roman"/>
+        </w:rPr>
+        <w:t>**0.5) / (2*</w:t>
+      </w:r>
+      <w:r>
+        <w:rPr>
+          <w:rFonts w:ascii="Times New Roman" w:hAnsi="Times New Roman" w:cs="Times New Roman"/>
+          <w:lang w:val="en-US"/>
+        </w:rPr>
+        <w:t>a</w:t>
+      </w:r>
+      <w:r>
+        <w:rPr>
+          <w:rFonts w:ascii="Times New Roman" w:hAnsi="Times New Roman" w:cs="Times New Roman"/>
+        </w:rPr>
+        <w:t>)</w:t>
+      </w:r>
+      <w:r>
+        <w:rPr>
+          <w:rFonts w:ascii="Times New Roman" w:hAnsi="Times New Roman" w:cs="Times New Roman"/>
         </w:rPr>
         <w:br/>
         <w:t xml:space="preserve">    </w:t>
       </w:r>
-      <w:proofErr w:type="spellStart"/>
-      <w:r>
-        <w:rPr>
-          <w:rFonts w:ascii="Times New Roman" w:hAnsi="Times New Roman" w:cs="Times New Roman"/>
-          <w:lang w:val="en-US"/>
-        </w:rPr>
-        <w:t>print</w:t>
-      </w:r>
-      <w:proofErr w:type="spellEnd"/>
-      <w:r>
-        <w:rPr>
-          <w:rFonts w:ascii="Times New Roman" w:hAnsi="Times New Roman" w:cs="Times New Roman"/>
-          <w:lang w:val="en-US"/>
-        </w:rPr>
-        <w:t>(</w:t>
-      </w:r>
-      <w:proofErr w:type="spellStart"/>
-      <w:r>
-        <w:rPr>
-          <w:rFonts w:ascii="Times New Roman" w:hAnsi="Times New Roman" w:cs="Times New Roman"/>
-          <w:lang w:val="en-US"/>
-        </w:rPr>
-        <w:t>f"Один</w:t>
-      </w:r>
-      <w:proofErr w:type="spellEnd"/>
-      <w:r>
-        <w:rPr>
-          <w:rFonts w:ascii="Times New Roman" w:hAnsi="Times New Roman" w:cs="Times New Roman"/>
-          <w:lang w:val="en-US"/>
-        </w:rPr>
-        <w:t xml:space="preserve"> корень: {x}")</w:t>
-      </w:r>
-      <w:r>
-        <w:rPr>
-          <w:rFonts w:ascii="Times New Roman" w:hAnsi="Times New Roman" w:cs="Times New Roman"/>
-          <w:lang w:val="en-US"/>
-        </w:rPr>
-        <w:br/>
-      </w:r>
-      <w:proofErr w:type="spellStart"/>
-      <w:r>
-        <w:rPr>
-          <w:rFonts w:ascii="Times New Roman" w:hAnsi="Times New Roman" w:cs="Times New Roman"/>
-          <w:lang w:val="en-US"/>
-        </w:rPr>
-        <w:t>else</w:t>
-      </w:r>
-      <w:proofErr w:type="spellEnd"/>
-      <w:r>
-        <w:rPr>
-          <w:rFonts w:ascii="Times New Roman" w:hAnsi="Times New Roman" w:cs="Times New Roman"/>
-          <w:lang w:val="en-US"/>
-        </w:rPr>
-        <w:t>:</w:t>
-      </w:r>
-      <w:r>
-        <w:rPr>
-          <w:rFonts w:ascii="Times New Roman" w:hAnsi="Times New Roman" w:cs="Times New Roman"/>
-          <w:lang w:val="en-US"/>
+      <w:r>
+        <w:rPr>
+          <w:rFonts w:ascii="Times New Roman" w:hAnsi="Times New Roman" w:cs="Times New Roman"/>
+          <w:lang w:val="en-US"/>
+        </w:rPr>
+        <w:t>x</w:t>
+      </w:r>
+      <w:r>
+        <w:rPr>
+          <w:rFonts w:ascii="Times New Roman" w:hAnsi="Times New Roman" w:cs="Times New Roman"/>
+        </w:rPr>
+        <w:t>2 = (-</w:t>
+      </w:r>
+      <w:r>
+        <w:rPr>
+          <w:rFonts w:ascii="Times New Roman" w:hAnsi="Times New Roman" w:cs="Times New Roman"/>
+          <w:lang w:val="en-US"/>
+        </w:rPr>
+        <w:t>b</w:t>
+      </w:r>
+      <w:r>
+        <w:rPr>
+          <w:rFonts w:ascii="Times New Roman" w:hAnsi="Times New Roman" w:cs="Times New Roman"/>
+        </w:rPr>
+        <w:t xml:space="preserve"> - </w:t>
+      </w:r>
+      <w:r>
+        <w:rPr>
+          <w:rFonts w:ascii="Times New Roman" w:hAnsi="Times New Roman" w:cs="Times New Roman"/>
+          <w:lang w:val="en-US"/>
+        </w:rPr>
+        <w:t>D</w:t>
+      </w:r>
+      <w:r>
+        <w:rPr>
+          <w:rFonts w:ascii="Times New Roman" w:hAnsi="Times New Roman" w:cs="Times New Roman"/>
+        </w:rPr>
+        <w:t>**0.5) / (2*</w:t>
+      </w:r>
+      <w:r>
+        <w:rPr>
+          <w:rFonts w:ascii="Times New Roman" w:hAnsi="Times New Roman" w:cs="Times New Roman"/>
+          <w:lang w:val="en-US"/>
+        </w:rPr>
+        <w:t>a</w:t>
+      </w:r>
+      <w:r>
+        <w:rPr>
+          <w:rFonts w:ascii="Times New Roman" w:hAnsi="Times New Roman" w:cs="Times New Roman"/>
+        </w:rPr>
+        <w:t>)</w:t>
+      </w:r>
+      <w:r>
+        <w:rPr>
+          <w:rFonts w:ascii="Times New Roman" w:hAnsi="Times New Roman" w:cs="Times New Roman"/>
         </w:rPr>
         <w:br/>
         <w:t xml:space="preserve">    </w:t>
       </w:r>
+      <w:r>
+        <w:rPr>
+          <w:rFonts w:ascii="Times New Roman" w:hAnsi="Times New Roman" w:cs="Times New Roman"/>
+          <w:lang w:val="en-US"/>
+        </w:rPr>
+        <w:t>print</w:t>
+      </w:r>
+      <w:r>
+        <w:rPr>
+          <w:rFonts w:ascii="Times New Roman" w:hAnsi="Times New Roman" w:cs="Times New Roman"/>
+        </w:rPr>
+        <w:t>(</w:t>
+      </w:r>
+      <w:r>
+        <w:rPr>
+          <w:rFonts w:ascii="Times New Roman" w:hAnsi="Times New Roman" w:cs="Times New Roman"/>
+          <w:lang w:val="en-US"/>
+        </w:rPr>
+        <w:t>f</w:t>
+      </w:r>
+      <w:r>
+        <w:rPr>
+          <w:rFonts w:ascii="Times New Roman" w:hAnsi="Times New Roman" w:cs="Times New Roman"/>
+        </w:rPr>
+        <w:t>"Корни уравнения: {</w:t>
+      </w:r>
+      <w:r>
+        <w:rPr>
+          <w:rFonts w:ascii="Times New Roman" w:hAnsi="Times New Roman" w:cs="Times New Roman"/>
+          <w:lang w:val="en-US"/>
+        </w:rPr>
+        <w:t>x</w:t>
+      </w:r>
+      <w:r>
+        <w:rPr>
+          <w:rFonts w:ascii="Times New Roman" w:hAnsi="Times New Roman" w:cs="Times New Roman"/>
+        </w:rPr>
+        <w:t>1}, {</w:t>
+      </w:r>
+      <w:r>
+        <w:rPr>
+          <w:rFonts w:ascii="Times New Roman" w:hAnsi="Times New Roman" w:cs="Times New Roman"/>
+          <w:lang w:val="en-US"/>
+        </w:rPr>
+        <w:t>x</w:t>
+      </w:r>
+      <w:r>
+        <w:rPr>
+          <w:rFonts w:ascii="Times New Roman" w:hAnsi="Times New Roman" w:cs="Times New Roman"/>
+        </w:rPr>
+        <w:t>2}")</w:t>
+      </w:r>
+      <w:r>
+        <w:rPr>
+          <w:rFonts w:ascii="Times New Roman" w:hAnsi="Times New Roman" w:cs="Times New Roman"/>
+        </w:rPr>
+        <w:br/>
+      </w:r>
       <w:proofErr w:type="spellStart"/>
       <w:r>
         <w:rPr>
           <w:rFonts w:ascii="Times New Roman" w:hAnsi="Times New Roman" w:cs="Times New Roman"/>
           <w:lang w:val="en-US"/>
         </w:rPr>
+        <w:t>elif</w:t>
+      </w:r>
+      <w:proofErr w:type="spellEnd"/>
+      <w:r>
+        <w:rPr>
+          <w:rFonts w:ascii="Times New Roman" w:hAnsi="Times New Roman" w:cs="Times New Roman"/>
+        </w:rPr>
+        <w:t xml:space="preserve"> </w:t>
+      </w:r>
+      <w:r>
+        <w:rPr>
+          <w:rFonts w:ascii="Times New Roman" w:hAnsi="Times New Roman" w:cs="Times New Roman"/>
+          <w:lang w:val="en-US"/>
+        </w:rPr>
+        <w:t>D</w:t>
+      </w:r>
+      <w:r>
+        <w:rPr>
+          <w:rFonts w:ascii="Times New Roman" w:hAnsi="Times New Roman" w:cs="Times New Roman"/>
+        </w:rPr>
+        <w:t xml:space="preserve"> == 0:</w:t>
+      </w:r>
+      <w:r>
+        <w:rPr>
+          <w:rFonts w:ascii="Times New Roman" w:hAnsi="Times New Roman" w:cs="Times New Roman"/>
+        </w:rPr>
+        <w:br/>
+        <w:t xml:space="preserve">    </w:t>
+      </w:r>
+      <w:r>
+        <w:rPr>
+          <w:rFonts w:ascii="Times New Roman" w:hAnsi="Times New Roman" w:cs="Times New Roman"/>
+          <w:lang w:val="en-US"/>
+        </w:rPr>
+        <w:t>x</w:t>
+      </w:r>
+      <w:r>
+        <w:rPr>
+          <w:rFonts w:ascii="Times New Roman" w:hAnsi="Times New Roman" w:cs="Times New Roman"/>
+        </w:rPr>
+        <w:t xml:space="preserve"> = -</w:t>
+      </w:r>
+      <w:r>
+        <w:rPr>
+          <w:rFonts w:ascii="Times New Roman" w:hAnsi="Times New Roman" w:cs="Times New Roman"/>
+          <w:lang w:val="en-US"/>
+        </w:rPr>
+        <w:t>b</w:t>
+      </w:r>
+      <w:r>
+        <w:rPr>
+          <w:rFonts w:ascii="Times New Roman" w:hAnsi="Times New Roman" w:cs="Times New Roman"/>
+        </w:rPr>
+        <w:t xml:space="preserve"> / (2*</w:t>
+      </w:r>
+      <w:r>
+        <w:rPr>
+          <w:rFonts w:ascii="Times New Roman" w:hAnsi="Times New Roman" w:cs="Times New Roman"/>
+          <w:lang w:val="en-US"/>
+        </w:rPr>
+        <w:t>a</w:t>
+      </w:r>
+      <w:r>
+        <w:rPr>
+          <w:rFonts w:ascii="Times New Roman" w:hAnsi="Times New Roman" w:cs="Times New Roman"/>
+        </w:rPr>
+        <w:t>)</w:t>
+      </w:r>
+      <w:r>
+        <w:rPr>
+          <w:rFonts w:ascii="Times New Roman" w:hAnsi="Times New Roman" w:cs="Times New Roman"/>
+        </w:rPr>
+        <w:br/>
+        <w:t xml:space="preserve">    </w:t>
+      </w:r>
+      <w:r>
+        <w:rPr>
+          <w:rFonts w:ascii="Times New Roman" w:hAnsi="Times New Roman" w:cs="Times New Roman"/>
+          <w:lang w:val="en-US"/>
+        </w:rPr>
         <w:t>print</w:t>
       </w:r>
-      <w:proofErr w:type="spellEnd"/>
-      <w:r>
-        <w:rPr>
-          <w:rFonts w:ascii="Times New Roman" w:hAnsi="Times New Roman" w:cs="Times New Roman"/>
-          <w:lang w:val="en-US"/>
+      <w:r>
+        <w:rPr>
+          <w:rFonts w:ascii="Times New Roman" w:hAnsi="Times New Roman" w:cs="Times New Roman"/>
+        </w:rPr>
+        <w:t>(</w:t>
+      </w:r>
+      <w:r>
+        <w:rPr>
+          <w:rFonts w:ascii="Times New Roman" w:hAnsi="Times New Roman" w:cs="Times New Roman"/>
+          <w:lang w:val="en-US"/>
+        </w:rPr>
+        <w:t>f</w:t>
+      </w:r>
+      <w:r>
+        <w:rPr>
+          <w:rFonts w:ascii="Times New Roman" w:hAnsi="Times New Roman" w:cs="Times New Roman"/>
+        </w:rPr>
+        <w:t>"Один корень: {</w:t>
+      </w:r>
+      <w:r>
+        <w:rPr>
+          <w:rFonts w:ascii="Times New Roman" w:hAnsi="Times New Roman" w:cs="Times New Roman"/>
+          <w:lang w:val="en-US"/>
+        </w:rPr>
+        <w:t>x</w:t>
+      </w:r>
+      <w:r>
+        <w:rPr>
+          <w:rFonts w:ascii="Times New Roman" w:hAnsi="Times New Roman" w:cs="Times New Roman"/>
+        </w:rPr>
+        <w:t>}")</w:t>
+      </w:r>
+      <w:r>
+        <w:rPr>
+          <w:rFonts w:ascii="Times New Roman" w:hAnsi="Times New Roman" w:cs="Times New Roman"/>
+        </w:rPr>
+        <w:br/>
+      </w:r>
+      <w:r>
+        <w:rPr>
+          <w:rFonts w:ascii="Times New Roman" w:hAnsi="Times New Roman" w:cs="Times New Roman"/>
+          <w:lang w:val="en-US"/>
+        </w:rPr>
+        <w:t>else</w:t>
+      </w:r>
+      <w:r>
+        <w:rPr>
+          <w:rFonts w:ascii="Times New Roman" w:hAnsi="Times New Roman" w:cs="Times New Roman"/>
+        </w:rPr>
+        <w:t>:</w:t>
+      </w:r>
+      <w:r>
+        <w:rPr>
+          <w:rFonts w:ascii="Times New Roman" w:hAnsi="Times New Roman" w:cs="Times New Roman"/>
+        </w:rPr>
+        <w:br/>
+        <w:t xml:space="preserve">    </w:t>
+      </w:r>
+      <w:r>
+        <w:rPr>
+          <w:rFonts w:ascii="Times New Roman" w:hAnsi="Times New Roman" w:cs="Times New Roman"/>
+          <w:lang w:val="en-US"/>
+        </w:rPr>
+        <w:t>print</w:t>
+      </w:r>
+      <w:r>
+        <w:rPr>
+          <w:rFonts w:ascii="Times New Roman" w:hAnsi="Times New Roman" w:cs="Times New Roman"/>
         </w:rPr>
         <w:t>("Корней нет!")</w:t>
       </w:r>
@@ -2477,6 +2714,7 @@
       <w:r>
         <w:rPr>
           <w:rFonts w:ascii="Times New Roman" w:hAnsi="Times New Roman" w:cs="Times New Roman"/>
+          <w:noProof/>
         </w:rPr>
         <w:drawing>
           <wp:inline distT="0" distB="0" distL="0" distR="0" wp14:anchorId="2C61FB7F" wp14:editId="5A811759">
@@ -2632,6 +2870,7 @@
         <w:jc w:val="left"/>
         <w:rPr>
           <w:rFonts w:ascii="Times New Roman" w:hAnsi="Times New Roman" w:cs="Times New Roman"/>
+          <w:lang w:val="en-US"/>
         </w:rPr>
       </w:pPr>
       <w:r>
@@ -2733,6 +2972,7 @@
       <w:r>
         <w:rPr>
           <w:rFonts w:ascii="Times New Roman" w:hAnsi="Times New Roman" w:cs="Times New Roman"/>
+          <w:noProof/>
         </w:rPr>
         <w:drawing>
           <wp:inline distT="0" distB="0" distL="0" distR="0" wp14:anchorId="1740BC4F" wp14:editId="6445564E">
@@ -2900,6 +3140,7 @@
         <w:jc w:val="left"/>
         <w:rPr>
           <w:rFonts w:ascii="Times New Roman" w:hAnsi="Times New Roman" w:cs="Times New Roman"/>
+          <w:lang w:val="en-US"/>
         </w:rPr>
       </w:pPr>
       <w:r>
@@ -3083,6 +3324,7 @@
       <w:r>
         <w:rPr>
           <w:rFonts w:ascii="Times New Roman" w:hAnsi="Times New Roman" w:cs="Times New Roman"/>
+          <w:noProof/>
         </w:rPr>
         <w:drawing>
           <wp:inline distT="0" distB="0" distL="0" distR="0" wp14:anchorId="1B8280D0" wp14:editId="7FDB8E83">
@@ -3341,6 +3583,7 @@
       <w:r>
         <w:rPr>
           <w:rFonts w:ascii="Times New Roman" w:hAnsi="Times New Roman" w:cs="Times New Roman"/>
+          <w:noProof/>
         </w:rPr>
         <w:lastRenderedPageBreak/>
         <w:drawing>
@@ -3853,196 +4096,234 @@
           <w:rFonts w:ascii="Times New Roman" w:hAnsi="Times New Roman" w:cs="Times New Roman"/>
         </w:rPr>
       </w:pPr>
-      <w:r>
-        <w:rPr>
-          <w:rFonts w:ascii="Times New Roman" w:hAnsi="Times New Roman" w:cs="Times New Roman"/>
-          <w:lang w:val="en-US"/>
-        </w:rPr>
-        <w:t xml:space="preserve">a = </w:t>
-      </w:r>
       <w:proofErr w:type="spellStart"/>
+      <w:r>
+        <w:rPr>
+          <w:rFonts w:ascii="Times New Roman" w:hAnsi="Times New Roman" w:cs="Times New Roman"/>
+          <w:lang w:val="en-US"/>
+        </w:rPr>
+        <w:t>nums</w:t>
+      </w:r>
+      <w:proofErr w:type="spellEnd"/>
+      <w:r>
+        <w:rPr>
+          <w:rFonts w:ascii="Times New Roman" w:hAnsi="Times New Roman" w:cs="Times New Roman"/>
+          <w:lang w:val="en-US"/>
+        </w:rPr>
+        <w:t xml:space="preserve"> = [275.4, 0.0032, 3.45]</w:t>
+      </w:r>
+    </w:p>
+    <w:p>
+      <w:pPr>
+        <w:suppressAutoHyphens/>
+        <w:ind w:firstLine="0"/>
+        <w:jc w:val="left"/>
+        <w:rPr>
+          <w:rFonts w:ascii="Times New Roman" w:hAnsi="Times New Roman" w:cs="Times New Roman"/>
+          <w:lang w:val="en-US"/>
+        </w:rPr>
+      </w:pPr>
+      <w:r>
+        <w:rPr>
+          <w:rFonts w:ascii="Times New Roman" w:hAnsi="Times New Roman" w:cs="Times New Roman"/>
+          <w:lang w:val="en-US"/>
+        </w:rPr>
+        <w:t xml:space="preserve">for x in </w:t>
+      </w:r>
+      <w:proofErr w:type="spellStart"/>
+      <w:r>
+        <w:rPr>
+          <w:rFonts w:ascii="Times New Roman" w:hAnsi="Times New Roman" w:cs="Times New Roman"/>
+          <w:lang w:val="en-US"/>
+        </w:rPr>
+        <w:t>nums</w:t>
+      </w:r>
+      <w:proofErr w:type="spellEnd"/>
+      <w:r>
+        <w:rPr>
+          <w:rFonts w:ascii="Times New Roman" w:hAnsi="Times New Roman" w:cs="Times New Roman"/>
+          <w:lang w:val="en-US"/>
+        </w:rPr>
+        <w:t>:</w:t>
+      </w:r>
+    </w:p>
+    <w:p>
+      <w:pPr>
+        <w:suppressAutoHyphens/>
+        <w:ind w:firstLine="0"/>
+        <w:jc w:val="left"/>
+        <w:rPr>
+          <w:rFonts w:ascii="Times New Roman" w:hAnsi="Times New Roman" w:cs="Times New Roman"/>
+          <w:lang w:val="en-US"/>
+        </w:rPr>
+      </w:pPr>
+      <w:r>
+        <w:rPr>
+          <w:rFonts w:ascii="Times New Roman" w:hAnsi="Times New Roman" w:cs="Times New Roman"/>
+          <w:lang w:val="en-US"/>
+        </w:rPr>
+        <w:t>    n = 0</w:t>
+      </w:r>
+    </w:p>
+    <w:p>
+      <w:pPr>
+        <w:suppressAutoHyphens/>
+        <w:ind w:firstLine="0"/>
+        <w:jc w:val="left"/>
+        <w:rPr>
+          <w:rFonts w:ascii="Times New Roman" w:hAnsi="Times New Roman" w:cs="Times New Roman"/>
+          <w:lang w:val="en-US"/>
+        </w:rPr>
+      </w:pPr>
+      <w:r>
+        <w:rPr>
+          <w:rFonts w:ascii="Times New Roman" w:hAnsi="Times New Roman" w:cs="Times New Roman"/>
+          <w:lang w:val="en-US"/>
+        </w:rPr>
+        <w:t>    a = x</w:t>
+      </w:r>
+    </w:p>
+    <w:p>
+      <w:pPr>
+        <w:suppressAutoHyphens/>
+        <w:ind w:firstLine="0"/>
+        <w:jc w:val="left"/>
+        <w:rPr>
+          <w:rFonts w:ascii="Times New Roman" w:hAnsi="Times New Roman" w:cs="Times New Roman"/>
+          <w:lang w:val="en-US"/>
+        </w:rPr>
+      </w:pPr>
+      <w:r>
+        <w:rPr>
+          <w:rFonts w:ascii="Times New Roman" w:hAnsi="Times New Roman" w:cs="Times New Roman"/>
+          <w:lang w:val="en-US"/>
+        </w:rPr>
+        <w:t>    while abs(a) &gt;= 10:</w:t>
+      </w:r>
+    </w:p>
+    <w:p>
+      <w:pPr>
+        <w:suppressAutoHyphens/>
+        <w:ind w:firstLine="0"/>
+        <w:jc w:val="left"/>
+        <w:rPr>
+          <w:rFonts w:ascii="Times New Roman" w:hAnsi="Times New Roman" w:cs="Times New Roman"/>
+          <w:lang w:val="en-US"/>
+        </w:rPr>
+      </w:pPr>
+      <w:r>
+        <w:rPr>
+          <w:rFonts w:ascii="Times New Roman" w:hAnsi="Times New Roman" w:cs="Times New Roman"/>
+          <w:lang w:val="en-US"/>
+        </w:rPr>
+        <w:lastRenderedPageBreak/>
+        <w:t>        a /= 10</w:t>
+      </w:r>
+    </w:p>
+    <w:p>
+      <w:pPr>
+        <w:suppressAutoHyphens/>
+        <w:ind w:firstLine="0"/>
+        <w:jc w:val="left"/>
+        <w:rPr>
+          <w:rFonts w:ascii="Times New Roman" w:hAnsi="Times New Roman" w:cs="Times New Roman"/>
+          <w:lang w:val="en-US"/>
+        </w:rPr>
+      </w:pPr>
+      <w:r>
+        <w:rPr>
+          <w:rFonts w:ascii="Times New Roman" w:hAnsi="Times New Roman" w:cs="Times New Roman"/>
+          <w:lang w:val="en-US"/>
+        </w:rPr>
+        <w:t>        n += 1</w:t>
+      </w:r>
+    </w:p>
+    <w:p>
+      <w:pPr>
+        <w:suppressAutoHyphens/>
+        <w:ind w:firstLine="0"/>
+        <w:jc w:val="left"/>
+        <w:rPr>
+          <w:rFonts w:ascii="Times New Roman" w:hAnsi="Times New Roman" w:cs="Times New Roman"/>
+          <w:lang w:val="en-US"/>
+        </w:rPr>
+      </w:pPr>
+      <w:r>
+        <w:rPr>
+          <w:rFonts w:ascii="Times New Roman" w:hAnsi="Times New Roman" w:cs="Times New Roman"/>
+          <w:lang w:val="en-US"/>
+        </w:rPr>
+        <w:t xml:space="preserve">    while abs(a) &lt; 1 and </w:t>
+      </w:r>
       <w:proofErr w:type="gramStart"/>
       <w:r>
         <w:rPr>
           <w:rFonts w:ascii="Times New Roman" w:hAnsi="Times New Roman" w:cs="Times New Roman"/>
           <w:lang w:val="en-US"/>
         </w:rPr>
-        <w:t>float</w:t>
-      </w:r>
-      <w:proofErr w:type="spellEnd"/>
-      <w:r>
-        <w:rPr>
-          <w:rFonts w:ascii="Times New Roman" w:hAnsi="Times New Roman" w:cs="Times New Roman"/>
-          <w:lang w:val="en-US"/>
-        </w:rPr>
-        <w:t>(</w:t>
-      </w:r>
-      <w:proofErr w:type="spellStart"/>
+        <w:t>a !</w:t>
+      </w:r>
       <w:proofErr w:type="gramEnd"/>
       <w:r>
         <w:rPr>
           <w:rFonts w:ascii="Times New Roman" w:hAnsi="Times New Roman" w:cs="Times New Roman"/>
           <w:lang w:val="en-US"/>
         </w:rPr>
-        <w:t>input</w:t>
-      </w:r>
-      <w:proofErr w:type="spellEnd"/>
-      <w:r>
-        <w:rPr>
-          <w:rFonts w:ascii="Times New Roman" w:hAnsi="Times New Roman" w:cs="Times New Roman"/>
-          <w:lang w:val="en-US"/>
-        </w:rPr>
-        <w:t>("Введите первое число: "))</w:t>
-      </w:r>
-      <w:r>
-        <w:rPr>
-          <w:rFonts w:ascii="Times New Roman" w:hAnsi="Times New Roman" w:cs="Times New Roman"/>
-          <w:lang w:val="en-US"/>
-        </w:rPr>
-        <w:br/>
-        <w:t xml:space="preserve">b = </w:t>
-      </w:r>
-      <w:proofErr w:type="spellStart"/>
-      <w:r>
-        <w:rPr>
-          <w:rFonts w:ascii="Times New Roman" w:hAnsi="Times New Roman" w:cs="Times New Roman"/>
-          <w:lang w:val="en-US"/>
-        </w:rPr>
-        <w:t>float</w:t>
-      </w:r>
-      <w:proofErr w:type="spellEnd"/>
-      <w:r>
-        <w:rPr>
-          <w:rFonts w:ascii="Times New Roman" w:hAnsi="Times New Roman" w:cs="Times New Roman"/>
-          <w:lang w:val="en-US"/>
-        </w:rPr>
-        <w:t>(</w:t>
-      </w:r>
-      <w:proofErr w:type="spellStart"/>
-      <w:r>
-        <w:rPr>
-          <w:rFonts w:ascii="Times New Roman" w:hAnsi="Times New Roman" w:cs="Times New Roman"/>
-          <w:lang w:val="en-US"/>
-        </w:rPr>
-        <w:t>input</w:t>
-      </w:r>
-      <w:proofErr w:type="spellEnd"/>
-      <w:r>
-        <w:rPr>
-          <w:rFonts w:ascii="Times New Roman" w:hAnsi="Times New Roman" w:cs="Times New Roman"/>
-          <w:lang w:val="en-US"/>
-        </w:rPr>
-        <w:t>("Введите второе число: "))</w:t>
-      </w:r>
-      <w:r>
-        <w:rPr>
-          <w:rFonts w:ascii="Times New Roman" w:hAnsi="Times New Roman" w:cs="Times New Roman"/>
-          <w:lang w:val="en-US"/>
-        </w:rPr>
-        <w:br/>
-        <w:t xml:space="preserve">c = </w:t>
-      </w:r>
-      <w:proofErr w:type="spellStart"/>
-      <w:r>
-        <w:rPr>
-          <w:rFonts w:ascii="Times New Roman" w:hAnsi="Times New Roman" w:cs="Times New Roman"/>
-          <w:lang w:val="en-US"/>
-        </w:rPr>
-        <w:t>float</w:t>
-      </w:r>
-      <w:proofErr w:type="spellEnd"/>
-      <w:r>
-        <w:rPr>
-          <w:rFonts w:ascii="Times New Roman" w:hAnsi="Times New Roman" w:cs="Times New Roman"/>
-          <w:lang w:val="en-US"/>
-        </w:rPr>
-        <w:t>(</w:t>
-      </w:r>
-      <w:proofErr w:type="spellStart"/>
-      <w:r>
-        <w:rPr>
-          <w:rFonts w:ascii="Times New Roman" w:hAnsi="Times New Roman" w:cs="Times New Roman"/>
-          <w:lang w:val="en-US"/>
-        </w:rPr>
-        <w:t>input</w:t>
-      </w:r>
-      <w:proofErr w:type="spellEnd"/>
-      <w:r>
-        <w:rPr>
-          <w:rFonts w:ascii="Times New Roman" w:hAnsi="Times New Roman" w:cs="Times New Roman"/>
-          <w:lang w:val="en-US"/>
-        </w:rPr>
-        <w:t>("Введите третье число: "))</w:t>
-      </w:r>
-      <w:r>
-        <w:rPr>
-          <w:rFonts w:ascii="Times New Roman" w:hAnsi="Times New Roman" w:cs="Times New Roman"/>
-          <w:lang w:val="en-US"/>
-        </w:rPr>
-        <w:br/>
-      </w:r>
-      <w:proofErr w:type="spellStart"/>
-      <w:r>
-        <w:rPr>
-          <w:rFonts w:ascii="Times New Roman" w:hAnsi="Times New Roman" w:cs="Times New Roman"/>
-          <w:lang w:val="en-US"/>
-        </w:rPr>
-        <w:t>print</w:t>
-      </w:r>
-      <w:proofErr w:type="spellEnd"/>
-      <w:r>
-        <w:rPr>
-          <w:rFonts w:ascii="Times New Roman" w:hAnsi="Times New Roman" w:cs="Times New Roman"/>
-          <w:lang w:val="en-US"/>
-        </w:rPr>
-        <w:t>(f"{a} = {a:.3e}")</w:t>
-      </w:r>
-      <w:r>
-        <w:rPr>
-          <w:rFonts w:ascii="Times New Roman" w:hAnsi="Times New Roman" w:cs="Times New Roman"/>
-          <w:lang w:val="en-US"/>
-        </w:rPr>
-        <w:br/>
-      </w:r>
-      <w:proofErr w:type="spellStart"/>
-      <w:r>
-        <w:rPr>
-          <w:rFonts w:ascii="Times New Roman" w:hAnsi="Times New Roman" w:cs="Times New Roman"/>
-          <w:lang w:val="en-US"/>
-        </w:rPr>
-        <w:lastRenderedPageBreak/>
-        <w:t>print</w:t>
-      </w:r>
-      <w:proofErr w:type="spellEnd"/>
-      <w:r>
-        <w:rPr>
-          <w:rFonts w:ascii="Times New Roman" w:hAnsi="Times New Roman" w:cs="Times New Roman"/>
-          <w:lang w:val="en-US"/>
-        </w:rPr>
-        <w:t>(f"{b} = {b:.3e}")</w:t>
-      </w:r>
-      <w:r>
-        <w:rPr>
-          <w:rFonts w:ascii="Times New Roman" w:hAnsi="Times New Roman" w:cs="Times New Roman"/>
-          <w:lang w:val="en-US"/>
-        </w:rPr>
-        <w:br/>
-      </w:r>
-      <w:proofErr w:type="spellStart"/>
-      <w:r>
-        <w:rPr>
-          <w:rFonts w:ascii="Times New Roman" w:hAnsi="Times New Roman" w:cs="Times New Roman"/>
-          <w:lang w:val="en-US"/>
-        </w:rPr>
-        <w:t>print</w:t>
-      </w:r>
-      <w:proofErr w:type="spellEnd"/>
-      <w:r>
-        <w:rPr>
-          <w:rFonts w:ascii="Times New Roman" w:hAnsi="Times New Roman" w:cs="Times New Roman"/>
-          <w:lang w:val="en-US"/>
-        </w:rPr>
-        <w:t>(f"{c} = {c:.3e}")</w:t>
+        <w:t>= 0:</w:t>
+      </w:r>
+    </w:p>
+    <w:p>
+      <w:pPr>
+        <w:suppressAutoHyphens/>
+        <w:ind w:firstLine="0"/>
+        <w:jc w:val="left"/>
+        <w:rPr>
+          <w:rFonts w:ascii="Times New Roman" w:hAnsi="Times New Roman" w:cs="Times New Roman"/>
+          <w:lang w:val="en-US"/>
+        </w:rPr>
+      </w:pPr>
+      <w:r>
+        <w:rPr>
+          <w:rFonts w:ascii="Times New Roman" w:hAnsi="Times New Roman" w:cs="Times New Roman"/>
+          <w:lang w:val="en-US"/>
+        </w:rPr>
+        <w:t>        a *= 10</w:t>
+      </w:r>
+    </w:p>
+    <w:p>
+      <w:pPr>
+        <w:suppressAutoHyphens/>
+        <w:ind w:firstLine="0"/>
+        <w:jc w:val="left"/>
+        <w:rPr>
+          <w:rFonts w:ascii="Times New Roman" w:hAnsi="Times New Roman" w:cs="Times New Roman"/>
+          <w:lang w:val="en-US"/>
+        </w:rPr>
+      </w:pPr>
+      <w:r>
+        <w:rPr>
+          <w:rFonts w:ascii="Times New Roman" w:hAnsi="Times New Roman" w:cs="Times New Roman"/>
+          <w:lang w:val="en-US"/>
+        </w:rPr>
+        <w:t>        n -= 1</w:t>
+      </w:r>
+    </w:p>
+    <w:p>
+      <w:pPr>
+        <w:suppressAutoHyphens/>
+        <w:ind w:firstLine="0"/>
+        <w:jc w:val="left"/>
+        <w:rPr>
+          <w:rFonts w:ascii="Times New Roman" w:hAnsi="Times New Roman" w:cs="Times New Roman"/>
+          <w:lang w:val="en-US"/>
+        </w:rPr>
+      </w:pPr>
+      <w:r>
+        <w:rPr>
+          <w:rFonts w:ascii="Times New Roman" w:hAnsi="Times New Roman" w:cs="Times New Roman"/>
+          <w:lang w:val="en-US"/>
+        </w:rPr>
+        <w:t>    print(f"{a} * 10^{n}")</w:t>
       </w:r>
     </w:p>
     <w:p>
@@ -4056,13 +4337,14 @@
       </w:pPr>
       <w:r>
         <w:rPr>
-          <w:rFonts w:ascii="Times New Roman" w:hAnsi="Times New Roman" w:cs="Times New Roman"/>
+          <w:noProof/>
+          <w14:ligatures w14:val="standardContextual"/>
         </w:rPr>
         <w:drawing>
-          <wp:inline distT="0" distB="0" distL="0" distR="0" wp14:anchorId="386A171D" wp14:editId="3D8AC5DC">
-            <wp:extent cx="2770650" cy="1745673"/>
-            <wp:effectExtent l="0" t="0" r="0" b="6985"/>
-            <wp:docPr id="10" name="Рисунок 10"/>
+          <wp:inline distT="0" distB="0" distL="0" distR="0" wp14:anchorId="55824970" wp14:editId="31AF2E2D">
+            <wp:extent cx="3741419" cy="1512974"/>
+            <wp:effectExtent l="0" t="0" r="0" b="0"/>
+            <wp:docPr id="2" name="Рисунок 2"/>
             <wp:cNvGraphicFramePr>
               <a:graphicFrameLocks xmlns:a="http://schemas.openxmlformats.org/drawingml/2006/main" noChangeAspect="1"/>
             </wp:cNvGraphicFramePr>
@@ -4070,31 +4352,22 @@
               <a:graphicData uri="http://schemas.openxmlformats.org/drawingml/2006/picture">
                 <pic:pic xmlns:pic="http://schemas.openxmlformats.org/drawingml/2006/picture">
                   <pic:nvPicPr>
-                    <pic:cNvPr id="0" name="Picture 28"/>
-                    <pic:cNvPicPr>
-                      <a:picLocks noChangeAspect="1" noChangeArrowheads="1"/>
-                    </pic:cNvPicPr>
+                    <pic:cNvPr id="1" name=""/>
+                    <pic:cNvPicPr/>
                   </pic:nvPicPr>
                   <pic:blipFill rotWithShape="1">
-                    <a:blip r:embed="rId16" cstate="print">
-                      <a:extLst>
-                        <a:ext uri="{28A0092B-C50C-407E-A947-70E740481C1C}">
-                          <a14:useLocalDpi xmlns:a14="http://schemas.microsoft.com/office/drawing/2010/main" val="0"/>
-                        </a:ext>
-                      </a:extLst>
-                    </a:blip>
-                    <a:srcRect l="9563" t="64061" r="70260" b="13340"/>
+                    <a:blip r:embed="rId16"/>
+                    <a:srcRect l="9750" t="72063" r="71662" b="14576"/>
                     <a:stretch/>
                   </pic:blipFill>
                   <pic:spPr bwMode="auto">
                     <a:xfrm>
                       <a:off x="0" y="0"/>
-                      <a:ext cx="2797652" cy="1762686"/>
+                      <a:ext cx="3768596" cy="1523964"/>
                     </a:xfrm>
                     <a:prstGeom prst="rect">
                       <a:avLst/>
                     </a:prstGeom>
-                    <a:noFill/>
                     <a:ln>
                       <a:noFill/>
                     </a:ln>
@@ -4194,13 +4467,7 @@
         <w:rPr>
           <w:rFonts w:ascii="Times New Roman" w:hAnsi="Times New Roman" w:cs="Times New Roman"/>
         </w:rPr>
-        <w:t>0.7 + 90.5, округлив результат до трех знаков после десятичной точки и найдя его модуль</w:t>
-      </w:r>
-      <w:r>
-        <w:rPr>
-          <w:rFonts w:ascii="Times New Roman" w:hAnsi="Times New Roman" w:cs="Times New Roman"/>
-        </w:rPr>
-        <w:t>.</w:t>
+        <w:t>0.7 + 90.5, округлив результат до трех знаков после десятичной точки и найдя его модуль.</w:t>
       </w:r>
     </w:p>
     <w:p>
@@ -4218,6 +4485,7 @@
         <w:jc w:val="left"/>
         <w:rPr>
           <w:rFonts w:ascii="Times New Roman" w:hAnsi="Times New Roman" w:cs="Times New Roman"/>
+          <w:lang w:val="en-US"/>
         </w:rPr>
       </w:pPr>
       <w:r>
@@ -4271,6 +4539,7 @@
       <w:r>
         <w:rPr>
           <w:rFonts w:ascii="Times New Roman" w:hAnsi="Times New Roman" w:cs="Times New Roman"/>
+          <w:noProof/>
         </w:rPr>
         <w:drawing>
           <wp:inline distT="0" distB="0" distL="0" distR="0" wp14:anchorId="0FAC7EA2" wp14:editId="360246A1">
@@ -4463,7 +4732,6 @@
           <w:rFonts w:ascii="Times New Roman" w:hAnsi="Times New Roman" w:cs="Times New Roman"/>
           <w:lang w:val="en-US"/>
         </w:rPr>
-        <w:lastRenderedPageBreak/>
         <w:t>n</w:t>
       </w:r>
       <w:r>
@@ -4764,13 +5032,7 @@
         <w:rPr>
           <w:rFonts w:ascii="Times New Roman" w:hAnsi="Times New Roman" w:cs="Times New Roman"/>
         </w:rPr>
-        <w:t>3.3 + 2y) - |64:(x + y)| при x=-4.1, y=2</w:t>
-      </w:r>
-      <w:r>
-        <w:rPr>
-          <w:rFonts w:ascii="Times New Roman" w:hAnsi="Times New Roman" w:cs="Times New Roman"/>
-        </w:rPr>
-        <w:t>.</w:t>
+        <w:t>3.3 + 2y) - |64:(x + y)| при x=-4.1, y=2.</w:t>
       </w:r>
     </w:p>
     <w:p>
@@ -4957,6 +5219,7 @@
       <w:r>
         <w:rPr>
           <w:rFonts w:ascii="Times New Roman" w:hAnsi="Times New Roman" w:cs="Times New Roman"/>
+          <w:noProof/>
         </w:rPr>
         <w:drawing>
           <wp:inline distT="0" distB="0" distL="0" distR="0" wp14:anchorId="28F38330" wp14:editId="12B5149E">
@@ -5024,25 +5287,7 @@
         <w:rPr>
           <w:rFonts w:ascii="Times New Roman" w:hAnsi="Times New Roman" w:cs="Times New Roman"/>
         </w:rPr>
-        <w:t xml:space="preserve">Рисунок </w:t>
-      </w:r>
-      <w:r>
-        <w:rPr>
-          <w:rFonts w:ascii="Times New Roman" w:hAnsi="Times New Roman" w:cs="Times New Roman"/>
-        </w:rPr>
-        <w:t>13</w:t>
-      </w:r>
-      <w:r>
-        <w:rPr>
-          <w:rFonts w:ascii="Times New Roman" w:hAnsi="Times New Roman" w:cs="Times New Roman"/>
-        </w:rPr>
-        <w:t xml:space="preserve"> – Результат выполнения Задания </w:t>
-      </w:r>
-      <w:r>
-        <w:rPr>
-          <w:rFonts w:ascii="Times New Roman" w:hAnsi="Times New Roman" w:cs="Times New Roman"/>
-        </w:rPr>
-        <w:t>13</w:t>
+        <w:t>Рисунок 13 – Результат выполнения Задания 13</w:t>
       </w:r>
     </w:p>
     <w:p>
@@ -5146,6 +5391,7 @@
         <w:ind w:firstLine="0"/>
         <w:rPr>
           <w:rFonts w:ascii="Times New Roman" w:hAnsi="Times New Roman" w:cs="Times New Roman"/>
+          <w:lang w:val="en-US"/>
         </w:rPr>
       </w:pPr>
       <w:r>
@@ -5236,6 +5482,7 @@
         <w:rPr>
           <w:rFonts w:ascii="Times New Roman" w:hAnsi="Times New Roman" w:cs="Times New Roman"/>
         </w:rPr>
+        <w:lastRenderedPageBreak/>
         <w:t>print</w:t>
       </w:r>
       <w:proofErr w:type="spellEnd"/>
@@ -5294,8 +5541,8 @@
       <w:r>
         <w:rPr>
           <w:rFonts w:ascii="Times New Roman" w:hAnsi="Times New Roman" w:cs="Times New Roman"/>
-        </w:rPr>
-        <w:lastRenderedPageBreak/>
+          <w:noProof/>
+        </w:rPr>
         <w:drawing>
           <wp:inline distT="0" distB="0" distL="0" distR="0" wp14:anchorId="1A01ABE2" wp14:editId="08E6F5B1">
             <wp:extent cx="2774945" cy="1032164"/>

</xml_diff>